<commit_message>
Add external metrics and fix Poffices short polling
</commit_message>
<xml_diff>
--- a/reports/week2/FlowerNet_Week2_Feedback_Action_Report.docx
+++ b/reports/week2/FlowerNet_Week2_Feedback_Action_Report.docx
@@ -1696,6 +1696,961 @@
     </w:p>
     <w:p>
       <w:pPr>
+        <w:pStyle w:val="Heading2"/>
+      </w:pPr>
+      <w:r>
+        <w:rPr>
+          <w:rFonts w:ascii="Arial" w:hAnsi="Arial"/>
+          <w:color w:val="0F172A"/>
+        </w:rPr>
+        <w:t>4.1 Added External ROUGE/BERTScore Results</w:t>
+      </w:r>
+    </w:p>
+    <w:p>
+      <w:r>
+        <w:t>ROUGE is computed against explicit external references. BERTScore uses a locked xlm-roberta-base encoder on CPU; long candidates/references are trimmed head+tail to 4000 chars for reproducibility.</w:t>
+      </w:r>
+    </w:p>
+    <w:p>
+      <w:r>
+        <w:t>Reference protocol: FreshWiki-style topics use Wikipedia reference packs; education topics use published review/survey papers retrieved from Semantic Scholar/Crossref. The current reference file is saved under references/week2_reference_sets.json for auditability.</w:t>
+      </w:r>
+    </w:p>
+    <w:tbl>
+      <w:tblPr>
+        <w:tblStyle w:val="TableGrid"/>
+        <w:tblW w:type="auto" w:w="0"/>
+        <w:tblLook w:firstColumn="1" w:firstRow="1" w:lastColumn="0" w:lastRow="0" w:noHBand="0" w:noVBand="1" w:val="04A0"/>
+      </w:tblPr>
+      <w:tblGrid>
+        <w:gridCol w:w="1656"/>
+        <w:gridCol w:w="1656"/>
+        <w:gridCol w:w="1656"/>
+        <w:gridCol w:w="1656"/>
+        <w:gridCol w:w="1656"/>
+        <w:gridCol w:w="1656"/>
+      </w:tblGrid>
+      <w:tr>
+        <w:tc>
+          <w:tcPr>
+            <w:tcW w:type="dxa" w:w="1656"/>
+          </w:tcPr>
+          <w:p>
+            <w:r>
+              <w:rPr>
+                <w:b/>
+              </w:rPr>
+              <w:t>System</w:t>
+            </w:r>
+          </w:p>
+        </w:tc>
+        <w:tc>
+          <w:tcPr>
+            <w:tcW w:type="dxa" w:w="1656"/>
+          </w:tcPr>
+          <w:p>
+            <w:r>
+              <w:rPr>
+                <w:b/>
+              </w:rPr>
+              <w:t>N</w:t>
+            </w:r>
+          </w:p>
+        </w:tc>
+        <w:tc>
+          <w:tcPr>
+            <w:tcW w:type="dxa" w:w="1656"/>
+          </w:tcPr>
+          <w:p>
+            <w:r>
+              <w:rPr>
+                <w:b/>
+              </w:rPr>
+              <w:t>BERTScore F1</w:t>
+            </w:r>
+          </w:p>
+        </w:tc>
+        <w:tc>
+          <w:tcPr>
+            <w:tcW w:type="dxa" w:w="1656"/>
+          </w:tcPr>
+          <w:p>
+            <w:r>
+              <w:rPr>
+                <w:b/>
+              </w:rPr>
+              <w:t>ROUGE-L</w:t>
+            </w:r>
+          </w:p>
+        </w:tc>
+        <w:tc>
+          <w:tcPr>
+            <w:tcW w:type="dxa" w:w="1656"/>
+          </w:tcPr>
+          <w:p>
+            <w:r>
+              <w:rPr>
+                <w:b/>
+              </w:rPr>
+              <w:t>ROUGE-2</w:t>
+            </w:r>
+          </w:p>
+        </w:tc>
+        <w:tc>
+          <w:tcPr>
+            <w:tcW w:type="dxa" w:w="1656"/>
+          </w:tcPr>
+          <w:p>
+            <w:r>
+              <w:rPr>
+                <w:b/>
+              </w:rPr>
+              <w:t>ROUGE-1</w:t>
+            </w:r>
+          </w:p>
+        </w:tc>
+      </w:tr>
+      <w:tr>
+        <w:tc>
+          <w:tcPr>
+            <w:tcW w:type="dxa" w:w="1656"/>
+          </w:tcPr>
+          <w:p>
+            <w:r>
+              <w:t>flowernet_wo_bandit</w:t>
+            </w:r>
+          </w:p>
+        </w:tc>
+        <w:tc>
+          <w:tcPr>
+            <w:tcW w:type="dxa" w:w="1656"/>
+          </w:tcPr>
+          <w:p>
+            <w:r>
+              <w:t>15</w:t>
+            </w:r>
+          </w:p>
+        </w:tc>
+        <w:tc>
+          <w:tcPr>
+            <w:tcW w:type="dxa" w:w="1656"/>
+          </w:tcPr>
+          <w:p>
+            <w:r>
+              <w:t>0.7941</w:t>
+            </w:r>
+          </w:p>
+        </w:tc>
+        <w:tc>
+          <w:tcPr>
+            <w:tcW w:type="dxa" w:w="1656"/>
+          </w:tcPr>
+          <w:p>
+            <w:r>
+              <w:t>0.0449</w:t>
+            </w:r>
+          </w:p>
+        </w:tc>
+        <w:tc>
+          <w:tcPr>
+            <w:tcW w:type="dxa" w:w="1656"/>
+          </w:tcPr>
+          <w:p>
+            <w:r>
+              <w:t>0.0085</w:t>
+            </w:r>
+          </w:p>
+        </w:tc>
+        <w:tc>
+          <w:tcPr>
+            <w:tcW w:type="dxa" w:w="1656"/>
+          </w:tcPr>
+          <w:p>
+            <w:r>
+              <w:t>0.0659</w:t>
+            </w:r>
+          </w:p>
+        </w:tc>
+      </w:tr>
+      <w:tr>
+        <w:tc>
+          <w:tcPr>
+            <w:tcW w:type="dxa" w:w="1656"/>
+          </w:tcPr>
+          <w:p>
+            <w:r>
+              <w:t>flowernet_no_vc_budget20</w:t>
+            </w:r>
+          </w:p>
+        </w:tc>
+        <w:tc>
+          <w:tcPr>
+            <w:tcW w:type="dxa" w:w="1656"/>
+          </w:tcPr>
+          <w:p>
+            <w:r>
+              <w:t>15</w:t>
+            </w:r>
+          </w:p>
+        </w:tc>
+        <w:tc>
+          <w:tcPr>
+            <w:tcW w:type="dxa" w:w="1656"/>
+          </w:tcPr>
+          <w:p>
+            <w:r>
+              <w:t>0.7927</w:t>
+            </w:r>
+          </w:p>
+        </w:tc>
+        <w:tc>
+          <w:tcPr>
+            <w:tcW w:type="dxa" w:w="1656"/>
+          </w:tcPr>
+          <w:p>
+            <w:r>
+              <w:t>0.0396</w:t>
+            </w:r>
+          </w:p>
+        </w:tc>
+        <w:tc>
+          <w:tcPr>
+            <w:tcW w:type="dxa" w:w="1656"/>
+          </w:tcPr>
+          <w:p>
+            <w:r>
+              <w:t>0.0056</w:t>
+            </w:r>
+          </w:p>
+        </w:tc>
+        <w:tc>
+          <w:tcPr>
+            <w:tcW w:type="dxa" w:w="1656"/>
+          </w:tcPr>
+          <w:p>
+            <w:r>
+              <w:t>0.0540</w:t>
+            </w:r>
+          </w:p>
+        </w:tc>
+      </w:tr>
+      <w:tr>
+        <w:tc>
+          <w:tcPr>
+            <w:tcW w:type="dxa" w:w="1656"/>
+          </w:tcPr>
+          <w:p>
+            <w:r>
+              <w:t>vanilla_llm</w:t>
+            </w:r>
+          </w:p>
+        </w:tc>
+        <w:tc>
+          <w:tcPr>
+            <w:tcW w:type="dxa" w:w="1656"/>
+          </w:tcPr>
+          <w:p>
+            <w:r>
+              <w:t>15</w:t>
+            </w:r>
+          </w:p>
+        </w:tc>
+        <w:tc>
+          <w:tcPr>
+            <w:tcW w:type="dxa" w:w="1656"/>
+          </w:tcPr>
+          <w:p>
+            <w:r>
+              <w:t>0.7923</w:t>
+            </w:r>
+          </w:p>
+        </w:tc>
+        <w:tc>
+          <w:tcPr>
+            <w:tcW w:type="dxa" w:w="1656"/>
+          </w:tcPr>
+          <w:p>
+            <w:r>
+              <w:t>0.0259</w:t>
+            </w:r>
+          </w:p>
+        </w:tc>
+        <w:tc>
+          <w:tcPr>
+            <w:tcW w:type="dxa" w:w="1656"/>
+          </w:tcPr>
+          <w:p>
+            <w:r>
+              <w:t>0.0038</w:t>
+            </w:r>
+          </w:p>
+        </w:tc>
+        <w:tc>
+          <w:tcPr>
+            <w:tcW w:type="dxa" w:w="1656"/>
+          </w:tcPr>
+          <w:p>
+            <w:r>
+              <w:t>0.0330</w:t>
+            </w:r>
+          </w:p>
+        </w:tc>
+      </w:tr>
+      <w:tr>
+        <w:tc>
+          <w:tcPr>
+            <w:tcW w:type="dxa" w:w="1656"/>
+          </w:tcPr>
+          <w:p>
+            <w:r>
+              <w:t>cogwriter_adapter</w:t>
+            </w:r>
+          </w:p>
+        </w:tc>
+        <w:tc>
+          <w:tcPr>
+            <w:tcW w:type="dxa" w:w="1656"/>
+          </w:tcPr>
+          <w:p>
+            <w:r>
+              <w:t>15</w:t>
+            </w:r>
+          </w:p>
+        </w:tc>
+        <w:tc>
+          <w:tcPr>
+            <w:tcW w:type="dxa" w:w="1656"/>
+          </w:tcPr>
+          <w:p>
+            <w:r>
+              <w:t>0.7919</w:t>
+            </w:r>
+          </w:p>
+        </w:tc>
+        <w:tc>
+          <w:tcPr>
+            <w:tcW w:type="dxa" w:w="1656"/>
+          </w:tcPr>
+          <w:p>
+            <w:r>
+              <w:t>0.0188</w:t>
+            </w:r>
+          </w:p>
+        </w:tc>
+        <w:tc>
+          <w:tcPr>
+            <w:tcW w:type="dxa" w:w="1656"/>
+          </w:tcPr>
+          <w:p>
+            <w:r>
+              <w:t>0.0019</w:t>
+            </w:r>
+          </w:p>
+        </w:tc>
+        <w:tc>
+          <w:tcPr>
+            <w:tcW w:type="dxa" w:w="1656"/>
+          </w:tcPr>
+          <w:p>
+            <w:r>
+              <w:t>0.0245</w:t>
+            </w:r>
+          </w:p>
+        </w:tc>
+      </w:tr>
+      <w:tr>
+        <w:tc>
+          <w:tcPr>
+            <w:tcW w:type="dxa" w:w="1656"/>
+          </w:tcPr>
+          <w:p>
+            <w:r>
+              <w:t>self_refine</w:t>
+            </w:r>
+          </w:p>
+        </w:tc>
+        <w:tc>
+          <w:tcPr>
+            <w:tcW w:type="dxa" w:w="1656"/>
+          </w:tcPr>
+          <w:p>
+            <w:r>
+              <w:t>15</w:t>
+            </w:r>
+          </w:p>
+        </w:tc>
+        <w:tc>
+          <w:tcPr>
+            <w:tcW w:type="dxa" w:w="1656"/>
+          </w:tcPr>
+          <w:p>
+            <w:r>
+              <w:t>0.7917</w:t>
+            </w:r>
+          </w:p>
+        </w:tc>
+        <w:tc>
+          <w:tcPr>
+            <w:tcW w:type="dxa" w:w="1656"/>
+          </w:tcPr>
+          <w:p>
+            <w:r>
+              <w:t>0.0259</w:t>
+            </w:r>
+          </w:p>
+        </w:tc>
+        <w:tc>
+          <w:tcPr>
+            <w:tcW w:type="dxa" w:w="1656"/>
+          </w:tcPr>
+          <w:p>
+            <w:r>
+              <w:t>0.0025</w:t>
+            </w:r>
+          </w:p>
+        </w:tc>
+        <w:tc>
+          <w:tcPr>
+            <w:tcW w:type="dxa" w:w="1656"/>
+          </w:tcPr>
+          <w:p>
+            <w:r>
+              <w:t>0.0324</w:t>
+            </w:r>
+          </w:p>
+        </w:tc>
+      </w:tr>
+      <w:tr>
+        <w:tc>
+          <w:tcPr>
+            <w:tcW w:type="dxa" w:w="1656"/>
+          </w:tcPr>
+          <w:p>
+            <w:r>
+              <w:t>flowernet_wo_nli</w:t>
+            </w:r>
+          </w:p>
+        </w:tc>
+        <w:tc>
+          <w:tcPr>
+            <w:tcW w:type="dxa" w:w="1656"/>
+          </w:tcPr>
+          <w:p>
+            <w:r>
+              <w:t>15</w:t>
+            </w:r>
+          </w:p>
+        </w:tc>
+        <w:tc>
+          <w:tcPr>
+            <w:tcW w:type="dxa" w:w="1656"/>
+          </w:tcPr>
+          <w:p>
+            <w:r>
+              <w:t>0.7912</w:t>
+            </w:r>
+          </w:p>
+        </w:tc>
+        <w:tc>
+          <w:tcPr>
+            <w:tcW w:type="dxa" w:w="1656"/>
+          </w:tcPr>
+          <w:p>
+            <w:r>
+              <w:t>0.0345</w:t>
+            </w:r>
+          </w:p>
+        </w:tc>
+        <w:tc>
+          <w:tcPr>
+            <w:tcW w:type="dxa" w:w="1656"/>
+          </w:tcPr>
+          <w:p>
+            <w:r>
+              <w:t>0.0059</w:t>
+            </w:r>
+          </w:p>
+        </w:tc>
+        <w:tc>
+          <w:tcPr>
+            <w:tcW w:type="dxa" w:w="1656"/>
+          </w:tcPr>
+          <w:p>
+            <w:r>
+              <w:t>0.0457</w:t>
+            </w:r>
+          </w:p>
+        </w:tc>
+      </w:tr>
+      <w:tr>
+        <w:tc>
+          <w:tcPr>
+            <w:tcW w:type="dxa" w:w="1656"/>
+          </w:tcPr>
+          <w:p>
+            <w:r>
+              <w:t>flowernet_no_vc_direct</w:t>
+            </w:r>
+          </w:p>
+        </w:tc>
+        <w:tc>
+          <w:tcPr>
+            <w:tcW w:type="dxa" w:w="1656"/>
+          </w:tcPr>
+          <w:p>
+            <w:r>
+              <w:t>15</w:t>
+            </w:r>
+          </w:p>
+        </w:tc>
+        <w:tc>
+          <w:tcPr>
+            <w:tcW w:type="dxa" w:w="1656"/>
+          </w:tcPr>
+          <w:p>
+            <w:r>
+              <w:t>0.7912</w:t>
+            </w:r>
+          </w:p>
+        </w:tc>
+        <w:tc>
+          <w:tcPr>
+            <w:tcW w:type="dxa" w:w="1656"/>
+          </w:tcPr>
+          <w:p>
+            <w:r>
+              <w:t>0.0397</w:t>
+            </w:r>
+          </w:p>
+        </w:tc>
+        <w:tc>
+          <w:tcPr>
+            <w:tcW w:type="dxa" w:w="1656"/>
+          </w:tcPr>
+          <w:p>
+            <w:r>
+              <w:t>0.0056</w:t>
+            </w:r>
+          </w:p>
+        </w:tc>
+        <w:tc>
+          <w:tcPr>
+            <w:tcW w:type="dxa" w:w="1656"/>
+          </w:tcPr>
+          <w:p>
+            <w:r>
+              <w:t>0.0549</w:t>
+            </w:r>
+          </w:p>
+        </w:tc>
+      </w:tr>
+      <w:tr>
+        <w:tc>
+          <w:tcPr>
+            <w:tcW w:type="dxa" w:w="1656"/>
+          </w:tcPr>
+          <w:p>
+            <w:r>
+              <w:t>flowernet_full</w:t>
+            </w:r>
+          </w:p>
+        </w:tc>
+        <w:tc>
+          <w:tcPr>
+            <w:tcW w:type="dxa" w:w="1656"/>
+          </w:tcPr>
+          <w:p>
+            <w:r>
+              <w:t>15</w:t>
+            </w:r>
+          </w:p>
+        </w:tc>
+        <w:tc>
+          <w:tcPr>
+            <w:tcW w:type="dxa" w:w="1656"/>
+          </w:tcPr>
+          <w:p>
+            <w:r>
+              <w:t>0.7909</w:t>
+            </w:r>
+          </w:p>
+        </w:tc>
+        <w:tc>
+          <w:tcPr>
+            <w:tcW w:type="dxa" w:w="1656"/>
+          </w:tcPr>
+          <w:p>
+            <w:r>
+              <w:t>0.0415</w:t>
+            </w:r>
+          </w:p>
+        </w:tc>
+        <w:tc>
+          <w:tcPr>
+            <w:tcW w:type="dxa" w:w="1656"/>
+          </w:tcPr>
+          <w:p>
+            <w:r>
+              <w:t>0.0072</w:t>
+            </w:r>
+          </w:p>
+        </w:tc>
+        <w:tc>
+          <w:tcPr>
+            <w:tcW w:type="dxa" w:w="1656"/>
+          </w:tcPr>
+          <w:p>
+            <w:r>
+              <w:t>0.0587</w:t>
+            </w:r>
+          </w:p>
+        </w:tc>
+      </w:tr>
+      <w:tr>
+        <w:tc>
+          <w:tcPr>
+            <w:tcW w:type="dxa" w:w="1656"/>
+          </w:tcPr>
+          <w:p>
+            <w:r>
+              <w:t>flowernet_wo_multidim</w:t>
+            </w:r>
+          </w:p>
+        </w:tc>
+        <w:tc>
+          <w:tcPr>
+            <w:tcW w:type="dxa" w:w="1656"/>
+          </w:tcPr>
+          <w:p>
+            <w:r>
+              <w:t>15</w:t>
+            </w:r>
+          </w:p>
+        </w:tc>
+        <w:tc>
+          <w:tcPr>
+            <w:tcW w:type="dxa" w:w="1656"/>
+          </w:tcPr>
+          <w:p>
+            <w:r>
+              <w:t>0.7901</w:t>
+            </w:r>
+          </w:p>
+        </w:tc>
+        <w:tc>
+          <w:tcPr>
+            <w:tcW w:type="dxa" w:w="1656"/>
+          </w:tcPr>
+          <w:p>
+            <w:r>
+              <w:t>0.0393</w:t>
+            </w:r>
+          </w:p>
+        </w:tc>
+        <w:tc>
+          <w:tcPr>
+            <w:tcW w:type="dxa" w:w="1656"/>
+          </w:tcPr>
+          <w:p>
+            <w:r>
+              <w:t>0.0078</w:t>
+            </w:r>
+          </w:p>
+        </w:tc>
+        <w:tc>
+          <w:tcPr>
+            <w:tcW w:type="dxa" w:w="1656"/>
+          </w:tcPr>
+          <w:p>
+            <w:r>
+              <w:t>0.0531</w:t>
+            </w:r>
+          </w:p>
+        </w:tc>
+      </w:tr>
+      <w:tr>
+        <w:tc>
+          <w:tcPr>
+            <w:tcW w:type="dxa" w:w="1656"/>
+          </w:tcPr>
+          <w:p>
+            <w:r>
+              <w:t>arise_adapter</w:t>
+            </w:r>
+          </w:p>
+        </w:tc>
+        <w:tc>
+          <w:tcPr>
+            <w:tcW w:type="dxa" w:w="1656"/>
+          </w:tcPr>
+          <w:p>
+            <w:r>
+              <w:t>15</w:t>
+            </w:r>
+          </w:p>
+        </w:tc>
+        <w:tc>
+          <w:tcPr>
+            <w:tcW w:type="dxa" w:w="1656"/>
+          </w:tcPr>
+          <w:p>
+            <w:r>
+              <w:t>0.7886</w:t>
+            </w:r>
+          </w:p>
+        </w:tc>
+        <w:tc>
+          <w:tcPr>
+            <w:tcW w:type="dxa" w:w="1656"/>
+          </w:tcPr>
+          <w:p>
+            <w:r>
+              <w:t>0.0246</w:t>
+            </w:r>
+          </w:p>
+        </w:tc>
+        <w:tc>
+          <w:tcPr>
+            <w:tcW w:type="dxa" w:w="1656"/>
+          </w:tcPr>
+          <w:p>
+            <w:r>
+              <w:t>0.0027</w:t>
+            </w:r>
+          </w:p>
+        </w:tc>
+        <w:tc>
+          <w:tcPr>
+            <w:tcW w:type="dxa" w:w="1656"/>
+          </w:tcPr>
+          <w:p>
+            <w:r>
+              <w:t>0.0308</w:t>
+            </w:r>
+          </w:p>
+        </w:tc>
+      </w:tr>
+      <w:tr>
+        <w:tc>
+          <w:tcPr>
+            <w:tcW w:type="dxa" w:w="1656"/>
+          </w:tcPr>
+          <w:p>
+            <w:r>
+              <w:t>longwriter_gguf_ollama</w:t>
+            </w:r>
+          </w:p>
+        </w:tc>
+        <w:tc>
+          <w:tcPr>
+            <w:tcW w:type="dxa" w:w="1656"/>
+          </w:tcPr>
+          <w:p>
+            <w:r>
+              <w:t>15</w:t>
+            </w:r>
+          </w:p>
+        </w:tc>
+        <w:tc>
+          <w:tcPr>
+            <w:tcW w:type="dxa" w:w="1656"/>
+          </w:tcPr>
+          <w:p>
+            <w:r>
+              <w:t>0.0000</w:t>
+            </w:r>
+          </w:p>
+        </w:tc>
+        <w:tc>
+          <w:tcPr>
+            <w:tcW w:type="dxa" w:w="1656"/>
+          </w:tcPr>
+          <w:p>
+            <w:r>
+              <w:t>0.0000</w:t>
+            </w:r>
+          </w:p>
+        </w:tc>
+        <w:tc>
+          <w:tcPr>
+            <w:tcW w:type="dxa" w:w="1656"/>
+          </w:tcPr>
+          <w:p>
+            <w:r>
+              <w:t>0.0000</w:t>
+            </w:r>
+          </w:p>
+        </w:tc>
+        <w:tc>
+          <w:tcPr>
+            <w:tcW w:type="dxa" w:w="1656"/>
+          </w:tcPr>
+          <w:p>
+            <w:r>
+              <w:t>0.0000</w:t>
+            </w:r>
+          </w:p>
+        </w:tc>
+      </w:tr>
+    </w:tbl>
+    <w:p>
+      <w:r>
+        <w:t>Current external-metric finding: FlowerNet full is above the no-verifier/no-controller budget20 baseline on ROUGE-2 and ROUGE-L, which supports a real contribution from verification/control beyond call count. However, flowernet_wo_bandit currently leads on BERTScore/ROUGE, so the bandit/controller policy should be inspected for over-repair or reference drift before claiming FlowerNet full is the final best system.</w:t>
+      </w:r>
+    </w:p>
+    <w:tbl>
+      <w:tblPr>
+        <w:tblStyle w:val="TableGrid"/>
+        <w:tblW w:type="auto" w:w="0"/>
+        <w:tblLook w:firstColumn="1" w:firstRow="1" w:lastColumn="0" w:lastRow="0" w:noHBand="0" w:noVBand="1" w:val="04A0"/>
+      </w:tblPr>
+      <w:tblGrid>
+        <w:gridCol w:w="2484"/>
+        <w:gridCol w:w="2484"/>
+        <w:gridCol w:w="2484"/>
+        <w:gridCol w:w="2484"/>
+      </w:tblGrid>
+      <w:tr>
+        <w:tc>
+          <w:tcPr>
+            <w:tcW w:type="dxa" w:w="2484"/>
+          </w:tcPr>
+          <w:p>
+            <w:r>
+              <w:rPr>
+                <w:b/>
+              </w:rPr>
+              <w:t>Comparison</w:t>
+            </w:r>
+          </w:p>
+        </w:tc>
+        <w:tc>
+          <w:tcPr>
+            <w:tcW w:type="dxa" w:w="2484"/>
+          </w:tcPr>
+          <w:p>
+            <w:r>
+              <w:rPr>
+                <w:b/>
+              </w:rPr>
+              <w:t>BERTScore F1</w:t>
+            </w:r>
+          </w:p>
+        </w:tc>
+        <w:tc>
+          <w:tcPr>
+            <w:tcW w:type="dxa" w:w="2484"/>
+          </w:tcPr>
+          <w:p>
+            <w:r>
+              <w:rPr>
+                <w:b/>
+              </w:rPr>
+              <w:t>ROUGE-L</w:t>
+            </w:r>
+          </w:p>
+        </w:tc>
+        <w:tc>
+          <w:tcPr>
+            <w:tcW w:type="dxa" w:w="2484"/>
+          </w:tcPr>
+          <w:p>
+            <w:r>
+              <w:rPr>
+                <w:b/>
+              </w:rPr>
+              <w:t>Interpretation</w:t>
+            </w:r>
+          </w:p>
+        </w:tc>
+      </w:tr>
+      <w:tr>
+        <w:tc>
+          <w:tcPr>
+            <w:tcW w:type="dxa" w:w="2484"/>
+          </w:tcPr>
+          <w:p>
+            <w:r>
+              <w:t>Full vs no-VC budget20</w:t>
+            </w:r>
+          </w:p>
+        </w:tc>
+        <w:tc>
+          <w:tcPr>
+            <w:tcW w:type="dxa" w:w="2484"/>
+          </w:tcPr>
+          <w:p>
+            <w:r>
+              <w:t>0.7909 vs 0.7927</w:t>
+            </w:r>
+          </w:p>
+        </w:tc>
+        <w:tc>
+          <w:tcPr>
+            <w:tcW w:type="dxa" w:w="2484"/>
+          </w:tcPr>
+          <w:p>
+            <w:r>
+              <w:t>0.0415 vs 0.0396</w:t>
+            </w:r>
+          </w:p>
+        </w:tc>
+        <w:tc>
+          <w:tcPr>
+            <w:tcW w:type="dxa" w:w="2484"/>
+          </w:tcPr>
+          <w:p>
+            <w:r>
+              <w:t>Full improves lexical overlap but BERTScore gap is small; judge/human layers are needed.</w:t>
+            </w:r>
+          </w:p>
+        </w:tc>
+      </w:tr>
+      <w:tr>
+        <w:tc>
+          <w:tcPr>
+            <w:tcW w:type="dxa" w:w="2484"/>
+          </w:tcPr>
+          <w:p>
+            <w:r>
+              <w:t>Full vs wo-bandit</w:t>
+            </w:r>
+          </w:p>
+        </w:tc>
+        <w:tc>
+          <w:tcPr>
+            <w:tcW w:type="dxa" w:w="2484"/>
+          </w:tcPr>
+          <w:p>
+            <w:r>
+              <w:t>0.7909 vs 0.7941</w:t>
+            </w:r>
+          </w:p>
+        </w:tc>
+        <w:tc>
+          <w:tcPr>
+            <w:tcW w:type="dxa" w:w="2484"/>
+          </w:tcPr>
+          <w:p>
+            <w:r>
+              <w:t>0.0415 vs 0.0449</w:t>
+            </w:r>
+          </w:p>
+        </w:tc>
+        <w:tc>
+          <w:tcPr>
+            <w:tcW w:type="dxa" w:w="2484"/>
+          </w:tcPr>
+          <w:p>
+            <w:r>
+              <w:t>wo-bandit is currently stronger on these external overlap metrics; diagnose bandit strategy before main paper claims.</w:t>
+            </w:r>
+          </w:p>
+        </w:tc>
+      </w:tr>
+    </w:tbl>
+    <w:p>
+      <w:pPr>
         <w:pStyle w:val="Heading1"/>
       </w:pPr>
       <w:r>

</xml_diff>